<commit_message>
feat: complete phase 3 diagram recovery
</commit_message>
<xml_diff>
--- a/quality/manual-tests/phase-02/ARTestStudio_Manual_Test_Report_Persistence_Hardening_v1.0.docx
+++ b/quality/manual-tests/phase-02/ARTestStudio_Manual_Test_Report_Persistence_Hardening_v1.0.docx
@@ -1970,7 +1970,7 @@
               <w:rPr>
                 <w:sz w:val="18"/>
               </w:rPr>
-              <w:t>NOT RUN</w:t>
+              <w:t>PASSED</w:t>
             </w:r>
           </w:p>
         </w:tc>
@@ -2059,7 +2059,7 @@
               <w:rPr>
                 <w:sz w:val="18"/>
               </w:rPr>
-              <w:t>NOT RUN</w:t>
+              <w:t>PASSED</w:t>
             </w:r>
           </w:p>
         </w:tc>
@@ -2148,7 +2148,7 @@
               <w:rPr>
                 <w:sz w:val="18"/>
               </w:rPr>
-              <w:t>NOT RUN</w:t>
+              <w:t>PASSED</w:t>
             </w:r>
           </w:p>
         </w:tc>
@@ -2237,7 +2237,7 @@
               <w:rPr>
                 <w:sz w:val="18"/>
               </w:rPr>
-              <w:t>NOT RUN</w:t>
+              <w:t>PASSED</w:t>
             </w:r>
           </w:p>
         </w:tc>
@@ -2326,7 +2326,7 @@
               <w:rPr>
                 <w:sz w:val="18"/>
               </w:rPr>
-              <w:t>NOT RUN</w:t>
+              <w:t>PASSED</w:t>
             </w:r>
           </w:p>
         </w:tc>
@@ -2415,7 +2415,7 @@
               <w:rPr>
                 <w:sz w:val="18"/>
               </w:rPr>
-              <w:t>NOT RUN</w:t>
+              <w:t>PASSED</w:t>
             </w:r>
           </w:p>
         </w:tc>
@@ -2504,7 +2504,7 @@
               <w:rPr>
                 <w:sz w:val="18"/>
               </w:rPr>
-              <w:t>NOT RUN</w:t>
+              <w:t>PASSED</w:t>
             </w:r>
           </w:p>
         </w:tc>
@@ -2531,6 +2531,11 @@
       </w:tr>
     </w:tbl>
     <w:p>
+      <w:pPr>
+        <w:rPr>
+          <w:u w:val="single"/>
+        </w:rPr>
+      </w:pPr>
       <w:r>
         <w:br w:type="page"/>
       </w:r>

</xml_diff>